<commit_message>
feat: complete pdg v0.1 acceptance and engineering validation
</commit_message>
<xml_diff>
--- a/docs/appendix-a-implementation-file-manifest-v0.1.docx
+++ b/docs/appendix-a-implementation-file-manifest-v0.1.docx
@@ -153,7 +153,7 @@
           </w:tcPr>
           <w:p>
             <w:r>
-              <w:t>28 August 2026</w:t>
+              <w:t>30 August 2026</w:t>
             </w:r>
           </w:p>
         </w:tc>
@@ -981,7 +981,7 @@
                 <w:rFonts w:ascii="Consolas" w:hAnsi="Consolas" w:eastAsia="Consolas"/>
                 <w:sz w:val="16"/>
               </w:rPr>
-              <w:t>README.md</w:t>
+              <w:t>docs/README.md</w:t>
             </w:r>
           </w:p>
         </w:tc>

</xml_diff>